<commit_message>
sporządzenie konceptu na gre, wpisanie początkowych komend
</commit_message>
<xml_diff>
--- a/dokumentacja.docx
+++ b/dokumentacja.docx
@@ -1,37 +1,93 @@
 
 <file path=word/document.xml><?xml version="1.0" encoding="utf-8"?>
-<w:document xmlns:o="urn:schemas-microsoft-com:office:office" xmlns:r="http://schemas.openxmlformats.org/officeDocument/2006/relationships" xmlns:v="urn:schemas-microsoft-com:vml" xmlns:w="http://schemas.openxmlformats.org/wordprocessingml/2006/main" xmlns:w10="urn:schemas-microsoft-com:office:word" xmlns:wp="http://schemas.openxmlformats.org/drawingml/2006/wordprocessingDrawing" xmlns:pic="http://schemas.openxmlformats.org/drawingml/2006/picture" xmlns:wps="http://schemas.microsoft.com/office/word/2010/wordprocessingShape" xmlns:wpg="http://schemas.microsoft.com/office/word/2010/wordprocessingGroup" xmlns:mc="http://schemas.openxmlformats.org/markup-compatibility/2006" xmlns:wp14="http://schemas.microsoft.com/office/word/2010/wordprocessingDrawing" xmlns:w14="http://schemas.microsoft.com/office/word/2010/wordml" xmlns:w15="http://schemas.microsoft.com/office/word/2012/wordml" mc:Ignorable="w14 wp14 w15">
+<w:document xmlns:ve="http://schemas.openxmlformats.org/markup-compatibility/2006" xmlns:o="urn:schemas-microsoft-com:office:office" xmlns:r="http://schemas.openxmlformats.org/officeDocument/2006/relationships" xmlns:m="http://schemas.openxmlformats.org/officeDocument/2006/math" xmlns:v="urn:schemas-microsoft-com:vml" xmlns:wp="http://schemas.openxmlformats.org/drawingml/2006/wordprocessingDrawing" xmlns:w10="urn:schemas-microsoft-com:office:word" xmlns:w="http://schemas.openxmlformats.org/wordprocessingml/2006/main" xmlns:wne="http://schemas.microsoft.com/office/word/2006/wordml">
   <w:body>
     <w:p>
-      <w:pPr>
-        <w:pStyle w:val="Normal"/>
-        <w:bidi w:val="0"/>
-        <w:jc w:val="left"/>
-        <w:rPr/>
-      </w:pPr>
-      <w:r>
-        <w:rPr/>
-        <w:t>Start projektu dnia 26.05.2026</w:t>
+      <w:r>
+        <w:t>Start projektu dnia 27</w:t>
+      </w:r>
+      <w:r>
+        <w:t>.05.2026</w:t>
       </w:r>
     </w:p>
+    <w:p/>
+    <w:p>
+      <w:r>
+        <w:t xml:space="preserve">2.06 – wymyślenie pomysłu na grę, korzystając z pomocy </w:t>
+      </w:r>
+      <w:proofErr w:type="spellStart"/>
+      <w:r>
+        <w:t>ChatGPT</w:t>
+      </w:r>
+      <w:proofErr w:type="spellEnd"/>
+      <w:r>
+        <w:t>, gra to będzie zbieranie skarbów</w:t>
+      </w:r>
+      <w:r>
+        <w:t>. Zaznajomienie się ze sposobem tworzenia tej gry.</w:t>
+      </w:r>
+    </w:p>
+    <w:p/>
+    <w:p>
+      <w:r>
+        <w:rPr>
+          <w:noProof/>
+          <w:lang w:eastAsia="pl-PL" w:bidi="ar-SA"/>
+        </w:rPr>
+        <w:drawing>
+          <wp:inline distT="0" distB="0" distL="0" distR="0">
+            <wp:extent cx="5890484" cy="3575972"/>
+            <wp:effectExtent l="19050" t="0" r="0" b="0"/>
+            <wp:docPr id="2" name="Obraz 1" descr="Zrzut ekranu (1).png"/>
+            <wp:cNvGraphicFramePr>
+              <a:graphicFrameLocks xmlns:a="http://schemas.openxmlformats.org/drawingml/2006/main" noChangeAspect="1"/>
+            </wp:cNvGraphicFramePr>
+            <a:graphic xmlns:a="http://schemas.openxmlformats.org/drawingml/2006/main">
+              <a:graphicData uri="http://schemas.openxmlformats.org/drawingml/2006/picture">
+                <pic:pic xmlns:pic="http://schemas.openxmlformats.org/drawingml/2006/picture">
+                  <pic:nvPicPr>
+                    <pic:cNvPr id="0" name="Zrzut ekranu (1).png"/>
+                    <pic:cNvPicPr/>
+                  </pic:nvPicPr>
+                  <pic:blipFill>
+                    <a:blip r:embed="rId4"/>
+                    <a:stretch>
+                      <a:fillRect/>
+                    </a:stretch>
+                  </pic:blipFill>
+                  <pic:spPr>
+                    <a:xfrm>
+                      <a:off x="0" y="0"/>
+                      <a:ext cx="5891491" cy="3576583"/>
+                    </a:xfrm>
+                    <a:prstGeom prst="rect">
+                      <a:avLst/>
+                    </a:prstGeom>
+                  </pic:spPr>
+                </pic:pic>
+              </a:graphicData>
+            </a:graphic>
+          </wp:inline>
+        </w:drawing>
+      </w:r>
+    </w:p>
+    <w:p/>
     <w:sectPr>
-      <w:type w:val="nextPage"/>
       <w:pgSz w:w="11906" w:h="16838"/>
-      <w:pgMar w:left="1134" w:right="1134" w:gutter="0" w:header="0" w:top="1134" w:footer="0" w:bottom="1134"/>
-      <w:pgNumType w:fmt="decimal"/>
-      <w:formProt w:val="false"/>
-      <w:textDirection w:val="lrTb"/>
+      <w:pgMar w:top="1134" w:right="1134" w:bottom="1134" w:left="1134" w:header="0" w:footer="0" w:gutter="0"/>
+      <w:cols w:space="708"/>
+      <w:formProt w:val="0"/>
     </w:sectPr>
   </w:body>
 </w:document>
 </file>
 
 <file path=word/styles.xml><?xml version="1.0" encoding="utf-8"?>
-<w:styles xmlns:w="http://schemas.openxmlformats.org/wordprocessingml/2006/main" xmlns:w14="http://schemas.microsoft.com/office/word/2010/wordml" xmlns:mc="http://schemas.openxmlformats.org/markup-compatibility/2006" mc:Ignorable="w14">
+<w:styles xmlns:r="http://schemas.openxmlformats.org/officeDocument/2006/relationships" xmlns:w="http://schemas.openxmlformats.org/wordprocessingml/2006/main">
   <w:docDefaults>
     <w:rPrDefault>
       <w:rPr>
-        <w:rFonts w:ascii="Liberation Serif" w:hAnsi="Liberation Serif" w:eastAsia="NSimSun" w:cs="Arial"/>
+        <w:rFonts w:ascii="Liberation Serif" w:eastAsia="NSimSun" w:hAnsi="Liberation Serif" w:cs="Arial"/>
         <w:kern w:val="2"/>
         <w:sz w:val="24"/>
         <w:szCs w:val="24"/>
@@ -40,90 +96,266 @@
     </w:rPrDefault>
     <w:pPrDefault>
       <w:pPr>
-        <w:widowControl/>
-        <w:suppressAutoHyphens w:val="true"/>
+        <w:suppressAutoHyphens/>
       </w:pPr>
     </w:pPrDefault>
   </w:docDefaults>
-  <w:style w:type="paragraph" w:styleId="Normal">
+  <w:latentStyles w:defLockedState="0" w:defUIPriority="99" w:defSemiHidden="1" w:defUnhideWhenUsed="1" w:defQFormat="0" w:count="267">
+    <w:lsdException w:name="Normal" w:semiHidden="0" w:uiPriority="0" w:unhideWhenUsed="0" w:qFormat="1"/>
+    <w:lsdException w:name="heading 1" w:semiHidden="0" w:uiPriority="9" w:unhideWhenUsed="0" w:qFormat="1"/>
+    <w:lsdException w:name="heading 2" w:uiPriority="9" w:qFormat="1"/>
+    <w:lsdException w:name="heading 3" w:uiPriority="9" w:qFormat="1"/>
+    <w:lsdException w:name="heading 4" w:uiPriority="9" w:qFormat="1"/>
+    <w:lsdException w:name="heading 5" w:uiPriority="9" w:qFormat="1"/>
+    <w:lsdException w:name="heading 6" w:uiPriority="9" w:qFormat="1"/>
+    <w:lsdException w:name="heading 7" w:uiPriority="9" w:qFormat="1"/>
+    <w:lsdException w:name="heading 8" w:uiPriority="9" w:qFormat="1"/>
+    <w:lsdException w:name="heading 9" w:uiPriority="9" w:qFormat="1"/>
+    <w:lsdException w:name="toc 1" w:uiPriority="39"/>
+    <w:lsdException w:name="toc 2" w:uiPriority="39"/>
+    <w:lsdException w:name="toc 3" w:uiPriority="39"/>
+    <w:lsdException w:name="toc 4" w:uiPriority="39"/>
+    <w:lsdException w:name="toc 5" w:uiPriority="39"/>
+    <w:lsdException w:name="toc 6" w:uiPriority="39"/>
+    <w:lsdException w:name="toc 7" w:uiPriority="39"/>
+    <w:lsdException w:name="toc 8" w:uiPriority="39"/>
+    <w:lsdException w:name="toc 9" w:uiPriority="39"/>
+    <w:lsdException w:name="caption" w:uiPriority="35" w:qFormat="1"/>
+    <w:lsdException w:name="Title" w:semiHidden="0" w:uiPriority="10" w:unhideWhenUsed="0" w:qFormat="1"/>
+    <w:lsdException w:name="Default Paragraph Font" w:uiPriority="1"/>
+    <w:lsdException w:name="Subtitle" w:semiHidden="0" w:uiPriority="11" w:unhideWhenUsed="0" w:qFormat="1"/>
+    <w:lsdException w:name="Strong" w:semiHidden="0" w:uiPriority="22" w:unhideWhenUsed="0" w:qFormat="1"/>
+    <w:lsdException w:name="Emphasis" w:semiHidden="0" w:uiPriority="20" w:unhideWhenUsed="0" w:qFormat="1"/>
+    <w:lsdException w:name="Table Grid" w:semiHidden="0" w:uiPriority="59" w:unhideWhenUsed="0"/>
+    <w:lsdException w:name="Placeholder Text" w:unhideWhenUsed="0"/>
+    <w:lsdException w:name="No Spacing" w:semiHidden="0" w:uiPriority="1" w:unhideWhenUsed="0" w:qFormat="1"/>
+    <w:lsdException w:name="Light Shading" w:semiHidden="0" w:uiPriority="60" w:unhideWhenUsed="0"/>
+    <w:lsdException w:name="Light List" w:semiHidden="0" w:uiPriority="61" w:unhideWhenUsed="0"/>
+    <w:lsdException w:name="Light Grid" w:semiHidden="0" w:uiPriority="62" w:unhideWhenUsed="0"/>
+    <w:lsdException w:name="Medium Shading 1" w:semiHidden="0" w:uiPriority="63" w:unhideWhenUsed="0"/>
+    <w:lsdException w:name="Medium Shading 2" w:semiHidden="0" w:uiPriority="64" w:unhideWhenUsed="0"/>
+    <w:lsdException w:name="Medium List 1" w:semiHidden="0" w:uiPriority="65" w:unhideWhenUsed="0"/>
+    <w:lsdException w:name="Medium List 2" w:semiHidden="0" w:uiPriority="66" w:unhideWhenUsed="0"/>
+    <w:lsdException w:name="Medium Grid 1" w:semiHidden="0" w:uiPriority="67" w:unhideWhenUsed="0"/>
+    <w:lsdException w:name="Medium Grid 2" w:semiHidden="0" w:uiPriority="68" w:unhideWhenUsed="0"/>
+    <w:lsdException w:name="Medium Grid 3" w:semiHidden="0" w:uiPriority="69" w:unhideWhenUsed="0"/>
+    <w:lsdException w:name="Dark List" w:semiHidden="0" w:uiPriority="70" w:unhideWhenUsed="0"/>
+    <w:lsdException w:name="Colorful Shading" w:semiHidden="0" w:uiPriority="71" w:unhideWhenUsed="0"/>
+    <w:lsdException w:name="Colorful List" w:semiHidden="0" w:uiPriority="72" w:unhideWhenUsed="0"/>
+    <w:lsdException w:name="Colorful Grid" w:semiHidden="0" w:uiPriority="73" w:unhideWhenUsed="0"/>
+    <w:lsdException w:name="Light Shading Accent 1" w:semiHidden="0" w:uiPriority="60" w:unhideWhenUsed="0"/>
+    <w:lsdException w:name="Light List Accent 1" w:semiHidden="0" w:uiPriority="61" w:unhideWhenUsed="0"/>
+    <w:lsdException w:name="Light Grid Accent 1" w:semiHidden="0" w:uiPriority="62" w:unhideWhenUsed="0"/>
+    <w:lsdException w:name="Medium Shading 1 Accent 1" w:semiHidden="0" w:uiPriority="63" w:unhideWhenUsed="0"/>
+    <w:lsdException w:name="Medium Shading 2 Accent 1" w:semiHidden="0" w:uiPriority="64" w:unhideWhenUsed="0"/>
+    <w:lsdException w:name="Medium List 1 Accent 1" w:semiHidden="0" w:uiPriority="65" w:unhideWhenUsed="0"/>
+    <w:lsdException w:name="Revision" w:unhideWhenUsed="0"/>
+    <w:lsdException w:name="List Paragraph" w:semiHidden="0" w:uiPriority="34" w:unhideWhenUsed="0" w:qFormat="1"/>
+    <w:lsdException w:name="Quote" w:semiHidden="0" w:uiPriority="29" w:unhideWhenUsed="0" w:qFormat="1"/>
+    <w:lsdException w:name="Intense Quote" w:semiHidden="0" w:uiPriority="30" w:unhideWhenUsed="0" w:qFormat="1"/>
+    <w:lsdException w:name="Medium List 2 Accent 1" w:semiHidden="0" w:uiPriority="66" w:unhideWhenUsed="0"/>
+    <w:lsdException w:name="Medium Grid 1 Accent 1" w:semiHidden="0" w:uiPriority="67" w:unhideWhenUsed="0"/>
+    <w:lsdException w:name="Medium Grid 2 Accent 1" w:semiHidden="0" w:uiPriority="68" w:unhideWhenUsed="0"/>
+    <w:lsdException w:name="Medium Grid 3 Accent 1" w:semiHidden="0" w:uiPriority="69" w:unhideWhenUsed="0"/>
+    <w:lsdException w:name="Dark List Accent 1" w:semiHidden="0" w:uiPriority="70" w:unhideWhenUsed="0"/>
+    <w:lsdException w:name="Colorful Shading Accent 1" w:semiHidden="0" w:uiPriority="71" w:unhideWhenUsed="0"/>
+    <w:lsdException w:name="Colorful List Accent 1" w:semiHidden="0" w:uiPriority="72" w:unhideWhenUsed="0"/>
+    <w:lsdException w:name="Colorful Grid Accent 1" w:semiHidden="0" w:uiPriority="73" w:unhideWhenUsed="0"/>
+    <w:lsdException w:name="Light Shading Accent 2" w:semiHidden="0" w:uiPriority="60" w:unhideWhenUsed="0"/>
+    <w:lsdException w:name="Light List Accent 2" w:semiHidden="0" w:uiPriority="61" w:unhideWhenUsed="0"/>
+    <w:lsdException w:name="Light Grid Accent 2" w:semiHidden="0" w:uiPriority="62" w:unhideWhenUsed="0"/>
+    <w:lsdException w:name="Medium Shading 1 Accent 2" w:semiHidden="0" w:uiPriority="63" w:unhideWhenUsed="0"/>
+    <w:lsdException w:name="Medium Shading 2 Accent 2" w:semiHidden="0" w:uiPriority="64" w:unhideWhenUsed="0"/>
+    <w:lsdException w:name="Medium List 1 Accent 2" w:semiHidden="0" w:uiPriority="65" w:unhideWhenUsed="0"/>
+    <w:lsdException w:name="Medium List 2 Accent 2" w:semiHidden="0" w:uiPriority="66" w:unhideWhenUsed="0"/>
+    <w:lsdException w:name="Medium Grid 1 Accent 2" w:semiHidden="0" w:uiPriority="67" w:unhideWhenUsed="0"/>
+    <w:lsdException w:name="Medium Grid 2 Accent 2" w:semiHidden="0" w:uiPriority="68" w:unhideWhenUsed="0"/>
+    <w:lsdException w:name="Medium Grid 3 Accent 2" w:semiHidden="0" w:uiPriority="69" w:unhideWhenUsed="0"/>
+    <w:lsdException w:name="Dark List Accent 2" w:semiHidden="0" w:uiPriority="70" w:unhideWhenUsed="0"/>
+    <w:lsdException w:name="Colorful Shading Accent 2" w:semiHidden="0" w:uiPriority="71" w:unhideWhenUsed="0"/>
+    <w:lsdException w:name="Colorful List Accent 2" w:semiHidden="0" w:uiPriority="72" w:unhideWhenUsed="0"/>
+    <w:lsdException w:name="Colorful Grid Accent 2" w:semiHidden="0" w:uiPriority="73" w:unhideWhenUsed="0"/>
+    <w:lsdException w:name="Light Shading Accent 3" w:semiHidden="0" w:uiPriority="60" w:unhideWhenUsed="0"/>
+    <w:lsdException w:name="Light List Accent 3" w:semiHidden="0" w:uiPriority="61" w:unhideWhenUsed="0"/>
+    <w:lsdException w:name="Light Grid Accent 3" w:semiHidden="0" w:uiPriority="62" w:unhideWhenUsed="0"/>
+    <w:lsdException w:name="Medium Shading 1 Accent 3" w:semiHidden="0" w:uiPriority="63" w:unhideWhenUsed="0"/>
+    <w:lsdException w:name="Medium Shading 2 Accent 3" w:semiHidden="0" w:uiPriority="64" w:unhideWhenUsed="0"/>
+    <w:lsdException w:name="Medium List 1 Accent 3" w:semiHidden="0" w:uiPriority="65" w:unhideWhenUsed="0"/>
+    <w:lsdException w:name="Medium List 2 Accent 3" w:semiHidden="0" w:uiPriority="66" w:unhideWhenUsed="0"/>
+    <w:lsdException w:name="Medium Grid 1 Accent 3" w:semiHidden="0" w:uiPriority="67" w:unhideWhenUsed="0"/>
+    <w:lsdException w:name="Medium Grid 2 Accent 3" w:semiHidden="0" w:uiPriority="68" w:unhideWhenUsed="0"/>
+    <w:lsdException w:name="Medium Grid 3 Accent 3" w:semiHidden="0" w:uiPriority="69" w:unhideWhenUsed="0"/>
+    <w:lsdException w:name="Dark List Accent 3" w:semiHidden="0" w:uiPriority="70" w:unhideWhenUsed="0"/>
+    <w:lsdException w:name="Colorful Shading Accent 3" w:semiHidden="0" w:uiPriority="71" w:unhideWhenUsed="0"/>
+    <w:lsdException w:name="Colorful List Accent 3" w:semiHidden="0" w:uiPriority="72" w:unhideWhenUsed="0"/>
+    <w:lsdException w:name="Colorful Grid Accent 3" w:semiHidden="0" w:uiPriority="73" w:unhideWhenUsed="0"/>
+    <w:lsdException w:name="Light Shading Accent 4" w:semiHidden="0" w:uiPriority="60" w:unhideWhenUsed="0"/>
+    <w:lsdException w:name="Light List Accent 4" w:semiHidden="0" w:uiPriority="61" w:unhideWhenUsed="0"/>
+    <w:lsdException w:name="Light Grid Accent 4" w:semiHidden="0" w:uiPriority="62" w:unhideWhenUsed="0"/>
+    <w:lsdException w:name="Medium Shading 1 Accent 4" w:semiHidden="0" w:uiPriority="63" w:unhideWhenUsed="0"/>
+    <w:lsdException w:name="Medium Shading 2 Accent 4" w:semiHidden="0" w:uiPriority="64" w:unhideWhenUsed="0"/>
+    <w:lsdException w:name="Medium List 1 Accent 4" w:semiHidden="0" w:uiPriority="65" w:unhideWhenUsed="0"/>
+    <w:lsdException w:name="Medium List 2 Accent 4" w:semiHidden="0" w:uiPriority="66" w:unhideWhenUsed="0"/>
+    <w:lsdException w:name="Medium Grid 1 Accent 4" w:semiHidden="0" w:uiPriority="67" w:unhideWhenUsed="0"/>
+    <w:lsdException w:name="Medium Grid 2 Accent 4" w:semiHidden="0" w:uiPriority="68" w:unhideWhenUsed="0"/>
+    <w:lsdException w:name="Medium Grid 3 Accent 4" w:semiHidden="0" w:uiPriority="69" w:unhideWhenUsed="0"/>
+    <w:lsdException w:name="Dark List Accent 4" w:semiHidden="0" w:uiPriority="70" w:unhideWhenUsed="0"/>
+    <w:lsdException w:name="Colorful Shading Accent 4" w:semiHidden="0" w:uiPriority="71" w:unhideWhenUsed="0"/>
+    <w:lsdException w:name="Colorful List Accent 4" w:semiHidden="0" w:uiPriority="72" w:unhideWhenUsed="0"/>
+    <w:lsdException w:name="Colorful Grid Accent 4" w:semiHidden="0" w:uiPriority="73" w:unhideWhenUsed="0"/>
+    <w:lsdException w:name="Light Shading Accent 5" w:semiHidden="0" w:uiPriority="60" w:unhideWhenUsed="0"/>
+    <w:lsdException w:name="Light List Accent 5" w:semiHidden="0" w:uiPriority="61" w:unhideWhenUsed="0"/>
+    <w:lsdException w:name="Light Grid Accent 5" w:semiHidden="0" w:uiPriority="62" w:unhideWhenUsed="0"/>
+    <w:lsdException w:name="Medium Shading 1 Accent 5" w:semiHidden="0" w:uiPriority="63" w:unhideWhenUsed="0"/>
+    <w:lsdException w:name="Medium Shading 2 Accent 5" w:semiHidden="0" w:uiPriority="64" w:unhideWhenUsed="0"/>
+    <w:lsdException w:name="Medium List 1 Accent 5" w:semiHidden="0" w:uiPriority="65" w:unhideWhenUsed="0"/>
+    <w:lsdException w:name="Medium List 2 Accent 5" w:semiHidden="0" w:uiPriority="66" w:unhideWhenUsed="0"/>
+    <w:lsdException w:name="Medium Grid 1 Accent 5" w:semiHidden="0" w:uiPriority="67" w:unhideWhenUsed="0"/>
+    <w:lsdException w:name="Medium Grid 2 Accent 5" w:semiHidden="0" w:uiPriority="68" w:unhideWhenUsed="0"/>
+    <w:lsdException w:name="Medium Grid 3 Accent 5" w:semiHidden="0" w:uiPriority="69" w:unhideWhenUsed="0"/>
+    <w:lsdException w:name="Dark List Accent 5" w:semiHidden="0" w:uiPriority="70" w:unhideWhenUsed="0"/>
+    <w:lsdException w:name="Colorful Shading Accent 5" w:semiHidden="0" w:uiPriority="71" w:unhideWhenUsed="0"/>
+    <w:lsdException w:name="Colorful List Accent 5" w:semiHidden="0" w:uiPriority="72" w:unhideWhenUsed="0"/>
+    <w:lsdException w:name="Colorful Grid Accent 5" w:semiHidden="0" w:uiPriority="73" w:unhideWhenUsed="0"/>
+    <w:lsdException w:name="Light Shading Accent 6" w:semiHidden="0" w:uiPriority="60" w:unhideWhenUsed="0"/>
+    <w:lsdException w:name="Light List Accent 6" w:semiHidden="0" w:uiPriority="61" w:unhideWhenUsed="0"/>
+    <w:lsdException w:name="Light Grid Accent 6" w:semiHidden="0" w:uiPriority="62" w:unhideWhenUsed="0"/>
+    <w:lsdException w:name="Medium Shading 1 Accent 6" w:semiHidden="0" w:uiPriority="63" w:unhideWhenUsed="0"/>
+    <w:lsdException w:name="Medium Shading 2 Accent 6" w:semiHidden="0" w:uiPriority="64" w:unhideWhenUsed="0"/>
+    <w:lsdException w:name="Medium List 1 Accent 6" w:semiHidden="0" w:uiPriority="65" w:unhideWhenUsed="0"/>
+    <w:lsdException w:name="Medium List 2 Accent 6" w:semiHidden="0" w:uiPriority="66" w:unhideWhenUsed="0"/>
+    <w:lsdException w:name="Medium Grid 1 Accent 6" w:semiHidden="0" w:uiPriority="67" w:unhideWhenUsed="0"/>
+    <w:lsdException w:name="Medium Grid 2 Accent 6" w:semiHidden="0" w:uiPriority="68" w:unhideWhenUsed="0"/>
+    <w:lsdException w:name="Medium Grid 3 Accent 6" w:semiHidden="0" w:uiPriority="69" w:unhideWhenUsed="0"/>
+    <w:lsdException w:name="Dark List Accent 6" w:semiHidden="0" w:uiPriority="70" w:unhideWhenUsed="0"/>
+    <w:lsdException w:name="Colorful Shading Accent 6" w:semiHidden="0" w:uiPriority="71" w:unhideWhenUsed="0"/>
+    <w:lsdException w:name="Colorful List Accent 6" w:semiHidden="0" w:uiPriority="72" w:unhideWhenUsed="0"/>
+    <w:lsdException w:name="Colorful Grid Accent 6" w:semiHidden="0" w:uiPriority="73" w:unhideWhenUsed="0"/>
+    <w:lsdException w:name="Subtle Emphasis" w:semiHidden="0" w:uiPriority="19" w:unhideWhenUsed="0" w:qFormat="1"/>
+    <w:lsdException w:name="Intense Emphasis" w:semiHidden="0" w:uiPriority="21" w:unhideWhenUsed="0" w:qFormat="1"/>
+    <w:lsdException w:name="Subtle Reference" w:semiHidden="0" w:uiPriority="31" w:unhideWhenUsed="0" w:qFormat="1"/>
+    <w:lsdException w:name="Intense Reference" w:semiHidden="0" w:uiPriority="32" w:unhideWhenUsed="0" w:qFormat="1"/>
+    <w:lsdException w:name="Book Title" w:semiHidden="0" w:uiPriority="33" w:unhideWhenUsed="0" w:qFormat="1"/>
+    <w:lsdException w:name="Bibliography" w:uiPriority="37"/>
+    <w:lsdException w:name="TOC Heading" w:uiPriority="39" w:qFormat="1"/>
+  </w:latentStyles>
+  <w:style w:type="paragraph" w:default="1" w:styleId="Normalny">
     <w:name w:val="Normal"/>
     <w:qFormat/>
+    <w:rsid w:val="00A172B6"/>
+  </w:style>
+  <w:style w:type="character" w:default="1" w:styleId="Domylnaczcionkaakapitu">
+    <w:name w:val="Default Paragraph Font"/>
+    <w:uiPriority w:val="1"/>
+    <w:semiHidden/>
+    <w:unhideWhenUsed/>
+  </w:style>
+  <w:style w:type="table" w:default="1" w:styleId="Standardowy">
+    <w:name w:val="Normal Table"/>
+    <w:uiPriority w:val="99"/>
+    <w:semiHidden/>
+    <w:unhideWhenUsed/>
+    <w:qFormat/>
+    <w:tblPr>
+      <w:tblInd w:w="0" w:type="dxa"/>
+      <w:tblCellMar>
+        <w:top w:w="0" w:type="dxa"/>
+        <w:left w:w="108" w:type="dxa"/>
+        <w:bottom w:w="0" w:type="dxa"/>
+        <w:right w:w="108" w:type="dxa"/>
+      </w:tblCellMar>
+    </w:tblPr>
+  </w:style>
+  <w:style w:type="numbering" w:default="1" w:styleId="Bezlisty">
+    <w:name w:val="No List"/>
+    <w:uiPriority w:val="99"/>
+    <w:semiHidden/>
+    <w:unhideWhenUsed/>
+  </w:style>
+  <w:style w:type="paragraph" w:styleId="Nagwek">
+    <w:name w:val="header"/>
+    <w:basedOn w:val="Normalny"/>
+    <w:next w:val="Tekstpodstawowy"/>
+    <w:qFormat/>
+    <w:rsid w:val="00A172B6"/>
     <w:pPr>
-      <w:widowControl/>
-      <w:bidi w:val="0"/>
-    </w:pPr>
-    <w:rPr>
-      <w:rFonts w:ascii="Liberation Serif" w:hAnsi="Liberation Serif" w:eastAsia="NSimSun" w:cs="Arial"/>
-      <w:color w:val="auto"/>
-      <w:kern w:val="2"/>
-      <w:sz w:val="24"/>
-      <w:szCs w:val="24"/>
-      <w:lang w:val="pl-PL" w:eastAsia="zh-CN" w:bidi="hi-IN"/>
-    </w:rPr>
-  </w:style>
-  <w:style w:type="paragraph" w:styleId="Nagwek">
-    <w:name w:val="Nagłówek"/>
-    <w:basedOn w:val="Normal"/>
-    <w:next w:val="BodyText"/>
-    <w:qFormat/>
-    <w:pPr>
-      <w:keepNext w:val="true"/>
+      <w:keepNext/>
       <w:spacing w:before="240" w:after="120"/>
     </w:pPr>
     <w:rPr>
-      <w:rFonts w:ascii="Liberation Sans" w:hAnsi="Liberation Sans" w:eastAsia="Microsoft YaHei" w:cs="Arial"/>
+      <w:rFonts w:ascii="Liberation Sans" w:eastAsia="Microsoft YaHei" w:hAnsi="Liberation Sans"/>
       <w:sz w:val="28"/>
       <w:szCs w:val="28"/>
     </w:rPr>
   </w:style>
-  <w:style w:type="paragraph" w:styleId="BodyText">
+  <w:style w:type="paragraph" w:styleId="Tekstpodstawowy">
     <w:name w:val="Body Text"/>
-    <w:basedOn w:val="Normal"/>
+    <w:basedOn w:val="Normalny"/>
+    <w:rsid w:val="00A172B6"/>
     <w:pPr>
-      <w:spacing w:lineRule="auto" w:line="276" w:before="0" w:after="140"/>
+      <w:spacing w:after="140" w:line="276" w:lineRule="auto"/>
     </w:pPr>
-    <w:rPr/>
-  </w:style>
-  <w:style w:type="paragraph" w:styleId="List">
+  </w:style>
+  <w:style w:type="paragraph" w:styleId="Lista">
     <w:name w:val="List"/>
-    <w:basedOn w:val="BodyText"/>
-    <w:pPr/>
-    <w:rPr>
-      <w:rFonts w:cs="Arial"/>
-    </w:rPr>
-  </w:style>
-  <w:style w:type="paragraph" w:styleId="Caption">
+    <w:basedOn w:val="Tekstpodstawowy"/>
+    <w:rsid w:val="00A172B6"/>
+  </w:style>
+  <w:style w:type="paragraph" w:styleId="Legenda">
     <w:name w:val="caption"/>
-    <w:basedOn w:val="Normal"/>
+    <w:basedOn w:val="Normalny"/>
     <w:qFormat/>
+    <w:rsid w:val="00A172B6"/>
     <w:pPr>
       <w:suppressLineNumbers/>
       <w:spacing w:before="120" w:after="120"/>
     </w:pPr>
     <w:rPr>
-      <w:rFonts w:cs="Arial"/>
       <w:i/>
       <w:iCs/>
-      <w:sz w:val="24"/>
-      <w:szCs w:val="24"/>
     </w:rPr>
   </w:style>
-  <w:style w:type="paragraph" w:styleId="Indeks">
+  <w:style w:type="paragraph" w:customStyle="1" w:styleId="Indeks">
     <w:name w:val="Indeks"/>
-    <w:basedOn w:val="Normal"/>
+    <w:basedOn w:val="Normalny"/>
     <w:qFormat/>
+    <w:rsid w:val="00A172B6"/>
     <w:pPr>
       <w:suppressLineNumbers/>
     </w:pPr>
+  </w:style>
+  <w:style w:type="paragraph" w:styleId="Tekstdymka">
+    <w:name w:val="Balloon Text"/>
+    <w:basedOn w:val="Normalny"/>
+    <w:link w:val="TekstdymkaZnak"/>
+    <w:uiPriority w:val="99"/>
+    <w:semiHidden/>
+    <w:unhideWhenUsed/>
+    <w:rsid w:val="00FF5C09"/>
     <w:rPr>
-      <w:rFonts w:cs="Arial"/>
+      <w:rFonts w:ascii="Tahoma" w:hAnsi="Tahoma" w:cs="Mangal"/>
+      <w:sz w:val="16"/>
+      <w:szCs w:val="14"/>
+    </w:rPr>
+  </w:style>
+  <w:style w:type="character" w:customStyle="1" w:styleId="TekstdymkaZnak">
+    <w:name w:val="Tekst dymka Znak"/>
+    <w:basedOn w:val="Domylnaczcionkaakapitu"/>
+    <w:link w:val="Tekstdymka"/>
+    <w:uiPriority w:val="99"/>
+    <w:semiHidden/>
+    <w:rsid w:val="00FF5C09"/>
+    <w:rPr>
+      <w:rFonts w:ascii="Tahoma" w:hAnsi="Tahoma" w:cs="Mangal"/>
+      <w:sz w:val="16"/>
+      <w:szCs w:val="14"/>
     </w:rPr>
   </w:style>
 </w:styles>
 </file>
 
 <file path=word/theme/theme1.xml><?xml version="1.0" encoding="utf-8"?>
-<a:theme xmlns:a="http://schemas.openxmlformats.org/drawingml/2006/main" xmlns:r="http://schemas.openxmlformats.org/officeDocument/2006/relationships" name="Office">
+<a:theme xmlns:a="http://schemas.openxmlformats.org/drawingml/2006/main" name="Office">
   <a:themeElements>
     <a:clrScheme name="LibreOffice">
       <a:dk1>
@@ -165,14 +397,14 @@
     </a:clrScheme>
     <a:fontScheme name="Office">
       <a:majorFont>
-        <a:latin typeface="Arial" pitchFamily="0" charset="1"/>
-        <a:ea typeface="DejaVu Sans" pitchFamily="0" charset="1"/>
-        <a:cs typeface="DejaVu Sans" pitchFamily="0" charset="1"/>
+        <a:latin typeface="Arial"/>
+        <a:ea typeface="DejaVu Sans"/>
+        <a:cs typeface="DejaVu Sans"/>
       </a:majorFont>
       <a:minorFont>
-        <a:latin typeface="Arial" pitchFamily="0" charset="1"/>
-        <a:ea typeface="DejaVu Sans" pitchFamily="0" charset="1"/>
-        <a:cs typeface="DejaVu Sans" pitchFamily="0" charset="1"/>
+        <a:latin typeface="Arial"/>
+        <a:ea typeface="DejaVu Sans"/>
+        <a:cs typeface="DejaVu Sans"/>
       </a:minorFont>
     </a:fontScheme>
     <a:fmtScheme>
@@ -225,5 +457,7 @@
       </a:bgFillStyleLst>
     </a:fmtScheme>
   </a:themeElements>
+  <a:objectDefaults/>
+  <a:extraClrSchemeLst/>
 </a:theme>
 </file>
</xml_diff>

<commit_message>
Wprowadzenie planszy i punktów do zdobycia i naprawiono system przechodzenia do gry
</commit_message>
<xml_diff>
--- a/dokumentacja.docx
+++ b/dokumentacja.docx
@@ -36,8 +36,8 @@
         </w:rPr>
         <w:drawing>
           <wp:inline distT="0" distB="0" distL="0" distR="0">
-            <wp:extent cx="5890484" cy="3575972"/>
-            <wp:effectExtent l="19050" t="0" r="0" b="0"/>
+            <wp:extent cx="4600575" cy="2792899"/>
+            <wp:effectExtent l="19050" t="0" r="9525" b="0"/>
             <wp:docPr id="2" name="Obraz 1" descr="Zrzut ekranu (1).png"/>
             <wp:cNvGraphicFramePr>
               <a:graphicFrameLocks xmlns:a="http://schemas.openxmlformats.org/drawingml/2006/main" noChangeAspect="1"/>
@@ -58,7 +58,90 @@
                   <pic:spPr>
                     <a:xfrm>
                       <a:off x="0" y="0"/>
-                      <a:ext cx="5891491" cy="3576583"/>
+                      <a:ext cx="4606639" cy="2796580"/>
+                    </a:xfrm>
+                    <a:prstGeom prst="rect">
+                      <a:avLst/>
+                    </a:prstGeom>
+                  </pic:spPr>
+                </pic:pic>
+              </a:graphicData>
+            </a:graphic>
+          </wp:inline>
+        </w:drawing>
+      </w:r>
+    </w:p>
+    <w:p/>
+    <w:p>
+      <w:r>
+        <w:t xml:space="preserve">3.06 – stworzenie ekranu początkowego, wprowadzenie wyboru: rozpocznij albo wyjdź. Korzystanie z pomocy </w:t>
+      </w:r>
+      <w:proofErr w:type="spellStart"/>
+      <w:r>
+        <w:t>ChatGPT</w:t>
+      </w:r>
+      <w:proofErr w:type="spellEnd"/>
+      <w:r>
+        <w:t xml:space="preserve"> przy poprawkach i ewentualnych niedopatrzeniach oraz</w:t>
+      </w:r>
+    </w:p>
+    <w:p>
+      <w:pPr>
+        <w:rPr>
+          <w:noProof/>
+          <w:lang w:eastAsia="pl-PL" w:bidi="ar-SA"/>
+        </w:rPr>
+      </w:pPr>
+      <w:r>
+        <w:t>sprawdzanie czemu coś nie działa:</w:t>
+      </w:r>
+      <w:r>
+        <w:rPr>
+          <w:noProof/>
+          <w:lang w:eastAsia="pl-PL" w:bidi="ar-SA"/>
+        </w:rPr>
+        <w:t xml:space="preserve"> </w:t>
+      </w:r>
+    </w:p>
+    <w:p>
+      <w:pPr>
+        <w:rPr>
+          <w:noProof/>
+          <w:lang w:eastAsia="pl-PL" w:bidi="ar-SA"/>
+        </w:rPr>
+      </w:pPr>
+    </w:p>
+    <w:p>
+      <w:r>
+        <w:rPr>
+          <w:noProof/>
+          <w:lang w:eastAsia="pl-PL" w:bidi="ar-SA"/>
+        </w:rPr>
+        <w:drawing>
+          <wp:inline distT="0" distB="0" distL="0" distR="0">
+            <wp:extent cx="4886325" cy="3827740"/>
+            <wp:effectExtent l="19050" t="0" r="9525" b="0"/>
+            <wp:docPr id="3" name="Obraz 0" descr="Zrzut ekranu (2).png"/>
+            <wp:cNvGraphicFramePr>
+              <a:graphicFrameLocks xmlns:a="http://schemas.openxmlformats.org/drawingml/2006/main" noChangeAspect="1"/>
+            </wp:cNvGraphicFramePr>
+            <a:graphic xmlns:a="http://schemas.openxmlformats.org/drawingml/2006/main">
+              <a:graphicData uri="http://schemas.openxmlformats.org/drawingml/2006/picture">
+                <pic:pic xmlns:pic="http://schemas.openxmlformats.org/drawingml/2006/picture">
+                  <pic:nvPicPr>
+                    <pic:cNvPr id="0" name="Zrzut ekranu (2).png"/>
+                    <pic:cNvPicPr/>
+                  </pic:nvPicPr>
+                  <pic:blipFill>
+                    <a:blip r:embed="rId5"/>
+                    <a:stretch>
+                      <a:fillRect/>
+                    </a:stretch>
+                  </pic:blipFill>
+                  <pic:spPr>
+                    <a:xfrm>
+                      <a:off x="0" y="0"/>
+                      <a:ext cx="4890511" cy="3831019"/>
                     </a:xfrm>
                     <a:prstGeom prst="rect">
                       <a:avLst/>

</xml_diff>